<commit_message>
Fault Detection VAE Done but fault dataset not robust 20/06/2025
</commit_message>
<xml_diff>
--- a/4DOF/Fault Detector/Workflow.docx
+++ b/4DOF/Fault Detector/Workflow.docx
@@ -3128,6 +3128,543 @@
     </w:p>
     <w:p/>
     <w:p/>
+    <w:p>
+      <w:r>
+        <w:rPr>
+          <w:b/>
+          <w:bCs/>
+        </w:rPr>
+        <w:t>Next Step: Creating the Full Test Script for the VAE + CNN Pipeline</w:t>
+      </w:r>
+    </w:p>
+    <w:p>
+      <w:r>
+        <w:t>You now need a script (let's call it test_full_pipeline.py) that integrates both models and evaluates the end-to-end performance. This script will:</w:t>
+      </w:r>
+    </w:p>
+    <w:p>
+      <w:pPr>
+        <w:numPr>
+          <w:ilvl w:val="0"/>
+          <w:numId w:val="14"/>
+        </w:numPr>
+      </w:pPr>
+      <w:r>
+        <w:lastRenderedPageBreak/>
+        <w:t>Load the trained VAE and its normalization statistics.</w:t>
+      </w:r>
+    </w:p>
+    <w:p>
+      <w:pPr>
+        <w:numPr>
+          <w:ilvl w:val="0"/>
+          <w:numId w:val="14"/>
+        </w:numPr>
+      </w:pPr>
+      <w:r>
+        <w:t>Load the trained CNN fault type classifier.</w:t>
+      </w:r>
+    </w:p>
+    <w:p>
+      <w:pPr>
+        <w:numPr>
+          <w:ilvl w:val="0"/>
+          <w:numId w:val="14"/>
+        </w:numPr>
+      </w:pPr>
+      <w:r>
+        <w:t>Load your anomaly detection threshold(s) (e.g., from optimized_thresholds.json).</w:t>
+      </w:r>
+    </w:p>
+    <w:p>
+      <w:pPr>
+        <w:numPr>
+          <w:ilvl w:val="0"/>
+          <w:numId w:val="14"/>
+        </w:numPr>
+      </w:pPr>
+      <w:r>
+        <w:t>Process various test datasets (Normal, and the </w:t>
+      </w:r>
+      <w:r>
+        <w:rPr>
+          <w:i/>
+          <w:iCs/>
+        </w:rPr>
+        <w:t>remaining unseen portions</w:t>
+      </w:r>
+      <w:r>
+        <w:t> of your fault datasets).</w:t>
+      </w:r>
+    </w:p>
+    <w:p>
+      <w:pPr>
+        <w:numPr>
+          <w:ilvl w:val="0"/>
+          <w:numId w:val="14"/>
+        </w:numPr>
+      </w:pPr>
+      <w:r>
+        <w:rPr>
+          <w:b/>
+          <w:bCs/>
+        </w:rPr>
+        <w:t>For each window:</w:t>
+      </w:r>
+    </w:p>
+    <w:p>
+      <w:pPr>
+        <w:numPr>
+          <w:ilvl w:val="1"/>
+          <w:numId w:val="14"/>
+        </w:numPr>
+      </w:pPr>
+      <w:r>
+        <w:rPr>
+          <w:b/>
+          <w:bCs/>
+        </w:rPr>
+        <w:t>Stage 1 (VAE):</w:t>
+      </w:r>
+    </w:p>
+    <w:p>
+      <w:pPr>
+        <w:numPr>
+          <w:ilvl w:val="2"/>
+          <w:numId w:val="14"/>
+        </w:numPr>
+      </w:pPr>
+      <w:r>
+        <w:t>Preprocess the window (normalize using VAE's training mean/std, ensure correct shape).</w:t>
+      </w:r>
+    </w:p>
+    <w:p>
+      <w:pPr>
+        <w:numPr>
+          <w:ilvl w:val="2"/>
+          <w:numId w:val="14"/>
+        </w:numPr>
+      </w:pPr>
+      <w:r>
+        <w:t>Pass it through the VAE to get the reconstruction.</w:t>
+      </w:r>
+    </w:p>
+    <w:p>
+      <w:pPr>
+        <w:numPr>
+          <w:ilvl w:val="2"/>
+          <w:numId w:val="14"/>
+        </w:numPr>
+      </w:pPr>
+      <w:r>
+        <w:t>Calculate the chosen anomaly score (e.g., Correlation Complement).</w:t>
+      </w:r>
+    </w:p>
+    <w:p>
+      <w:pPr>
+        <w:numPr>
+          <w:ilvl w:val="2"/>
+          <w:numId w:val="14"/>
+        </w:numPr>
+      </w:pPr>
+      <w:r>
+        <w:t>Apply the optimized anomaly threshold to decide if it's "Normal" or "Anomalous."</w:t>
+      </w:r>
+    </w:p>
+    <w:p>
+      <w:pPr>
+        <w:numPr>
+          <w:ilvl w:val="1"/>
+          <w:numId w:val="14"/>
+        </w:numPr>
+      </w:pPr>
+      <w:r>
+        <w:rPr>
+          <w:b/>
+          <w:bCs/>
+        </w:rPr>
+        <w:t>Stage 2 (CNN):</w:t>
+      </w:r>
+    </w:p>
+    <w:p>
+      <w:pPr>
+        <w:numPr>
+          <w:ilvl w:val="2"/>
+          <w:numId w:val="14"/>
+        </w:numPr>
+      </w:pPr>
+      <w:r>
+        <w:t>If Stage 1 declares "Anomalous":</w:t>
+      </w:r>
+    </w:p>
+    <w:p>
+      <w:pPr>
+        <w:numPr>
+          <w:ilvl w:val="3"/>
+          <w:numId w:val="14"/>
+        </w:numPr>
+      </w:pPr>
+      <w:r>
+        <w:t>Take the </w:t>
+      </w:r>
+      <w:r>
+        <w:rPr>
+          <w:i/>
+          <w:iCs/>
+        </w:rPr>
+        <w:t>original (VAE-normalized) windowed data</w:t>
+      </w:r>
+      <w:r>
+        <w:t> (the input to the VAE).</w:t>
+      </w:r>
+    </w:p>
+    <w:p>
+      <w:pPr>
+        <w:numPr>
+          <w:ilvl w:val="3"/>
+          <w:numId w:val="14"/>
+        </w:numPr>
+      </w:pPr>
+      <w:r>
+        <w:t>Reshape it to match the CNN's input requirements (1, 1, SEQ_LEN, NUM_FEATURES).</w:t>
+      </w:r>
+    </w:p>
+    <w:p>
+      <w:pPr>
+        <w:numPr>
+          <w:ilvl w:val="3"/>
+          <w:numId w:val="14"/>
+        </w:numPr>
+      </w:pPr>
+      <w:r>
+        <w:t>Pass it to the trained CNN to get a prediction ("Sensor Fault" or "Structural Fault").</w:t>
+      </w:r>
+    </w:p>
+    <w:p>
+      <w:pPr>
+        <w:numPr>
+          <w:ilvl w:val="2"/>
+          <w:numId w:val="14"/>
+        </w:numPr>
+      </w:pPr>
+      <w:r>
+        <w:t>If Stage 1 declares "Normal," the prediction is "Normal."</w:t>
+      </w:r>
+    </w:p>
+    <w:p>
+      <w:pPr>
+        <w:numPr>
+          <w:ilvl w:val="0"/>
+          <w:numId w:val="14"/>
+        </w:numPr>
+      </w:pPr>
+      <w:r>
+        <w:t>Collect all true labels and final predicted labels (Normal, Sensor Fault, Structural Fault).</w:t>
+      </w:r>
+    </w:p>
+    <w:p>
+      <w:pPr>
+        <w:numPr>
+          <w:ilvl w:val="0"/>
+          <w:numId w:val="14"/>
+        </w:numPr>
+      </w:pPr>
+      <w:r>
+        <w:t>Calculate and display overall performance metrics (confusion matrix, precision, recall, F1 for each of the 3+ classes).</w:t>
+      </w:r>
+    </w:p>
+    <w:p/>
+    <w:p/>
+    <w:p/>
+    <w:p>
+      <w:r>
+        <w:rPr>
+          <w:b/>
+          <w:bCs/>
+        </w:rPr>
+        <w:t>Stage 1: Unsupervised/Hybrid Anomaly Detection</w:t>
+      </w:r>
+    </w:p>
+    <w:p>
+      <w:pPr>
+        <w:numPr>
+          <w:ilvl w:val="0"/>
+          <w:numId w:val="15"/>
+        </w:numPr>
+      </w:pPr>
+      <w:r>
+        <w:rPr>
+          <w:b/>
+          <w:bCs/>
+        </w:rPr>
+        <w:t>Input:</w:t>
+      </w:r>
+      <w:r>
+        <w:t xml:space="preserve"> Raw signal windows (x, v, a) → Preprocessed (mean/std) →</w:t>
+      </w:r>
+    </w:p>
+    <w:p>
+      <w:pPr>
+        <w:numPr>
+          <w:ilvl w:val="0"/>
+          <w:numId w:val="15"/>
+        </w:numPr>
+      </w:pPr>
+      <w:r>
+        <w:rPr>
+          <w:b/>
+          <w:bCs/>
+        </w:rPr>
+        <w:t>VAE:</w:t>
+      </w:r>
+      <w:r>
+        <w:t xml:space="preserve"> Encodes, reconstructs, computes latent features</w:t>
+      </w:r>
+    </w:p>
+    <w:p>
+      <w:pPr>
+        <w:numPr>
+          <w:ilvl w:val="0"/>
+          <w:numId w:val="15"/>
+        </w:numPr>
+      </w:pPr>
+      <w:r>
+        <w:rPr>
+          <w:b/>
+          <w:bCs/>
+        </w:rPr>
+        <w:t>Extract Features:</w:t>
+      </w:r>
+    </w:p>
+    <w:p>
+      <w:pPr>
+        <w:numPr>
+          <w:ilvl w:val="1"/>
+          <w:numId w:val="15"/>
+        </w:numPr>
+      </w:pPr>
+      <w:r>
+        <w:t>VAE reconstruction loss metrics (MSE, Correlation Complement, Physics-informed loss)</w:t>
+      </w:r>
+    </w:p>
+    <w:p>
+      <w:pPr>
+        <w:numPr>
+          <w:ilvl w:val="1"/>
+          <w:numId w:val="15"/>
+        </w:numPr>
+      </w:pPr>
+      <w:r>
+        <w:t>Additional signal features (statistical: mean, std, skew, kurtosis, RMS, etc., as in your script)</w:t>
+      </w:r>
+    </w:p>
+    <w:p>
+      <w:pPr>
+        <w:numPr>
+          <w:ilvl w:val="0"/>
+          <w:numId w:val="15"/>
+        </w:numPr>
+      </w:pPr>
+      <w:r>
+        <w:rPr>
+          <w:b/>
+          <w:bCs/>
+        </w:rPr>
+        <w:t>Feature Vector:</w:t>
+      </w:r>
+      <w:r>
+        <w:t xml:space="preserve"> Concatenate all these features for each window</w:t>
+      </w:r>
+    </w:p>
+    <w:p>
+      <w:pPr>
+        <w:numPr>
+          <w:ilvl w:val="0"/>
+          <w:numId w:val="15"/>
+        </w:numPr>
+      </w:pPr>
+      <w:r>
+        <w:rPr>
+          <w:b/>
+          <w:bCs/>
+        </w:rPr>
+        <w:t>Kernel SVM:</w:t>
+      </w:r>
+    </w:p>
+    <w:p>
+      <w:pPr>
+        <w:numPr>
+          <w:ilvl w:val="1"/>
+          <w:numId w:val="15"/>
+        </w:numPr>
+      </w:pPr>
+      <w:r>
+        <w:rPr>
+          <w:b/>
+          <w:bCs/>
+        </w:rPr>
+        <w:t>Train SVM on validation data:</w:t>
+      </w:r>
+      <w:r>
+        <w:t xml:space="preserve"> SVM trained to separate </w:t>
+      </w:r>
+      <w:r>
+        <w:rPr>
+          <w:i/>
+          <w:iCs/>
+        </w:rPr>
+        <w:t>normal</w:t>
+      </w:r>
+      <w:r>
+        <w:t xml:space="preserve"> and </w:t>
+      </w:r>
+      <w:r>
+        <w:rPr>
+          <w:i/>
+          <w:iCs/>
+        </w:rPr>
+        <w:t>fault</w:t>
+      </w:r>
+      <w:r>
+        <w:t xml:space="preserve"> (or only normal if you want to use One-Class SVM style; in your current setup, you use both classes, which is fine for SVM as a classifier)</w:t>
+      </w:r>
+    </w:p>
+    <w:p>
+      <w:pPr>
+        <w:numPr>
+          <w:ilvl w:val="1"/>
+          <w:numId w:val="15"/>
+        </w:numPr>
+      </w:pPr>
+      <w:r>
+        <w:rPr>
+          <w:b/>
+          <w:bCs/>
+        </w:rPr>
+        <w:t>Find threshold</w:t>
+      </w:r>
+      <w:r>
+        <w:t xml:space="preserve"> using validation F1 or other score, as you’ve done</w:t>
+      </w:r>
+    </w:p>
+    <w:p>
+      <w:pPr>
+        <w:numPr>
+          <w:ilvl w:val="0"/>
+          <w:numId w:val="15"/>
+        </w:numPr>
+      </w:pPr>
+      <w:r>
+        <w:rPr>
+          <w:b/>
+          <w:bCs/>
+        </w:rPr>
+        <w:t>Decision:</w:t>
+      </w:r>
+    </w:p>
+    <w:p>
+      <w:pPr>
+        <w:numPr>
+          <w:ilvl w:val="1"/>
+          <w:numId w:val="15"/>
+        </w:numPr>
+      </w:pPr>
+      <w:r>
+        <w:t xml:space="preserve">If SVM score ≥ threshold → </w:t>
+      </w:r>
+      <w:r>
+        <w:rPr>
+          <w:b/>
+          <w:bCs/>
+        </w:rPr>
+        <w:t>Normal</w:t>
+      </w:r>
+    </w:p>
+    <w:p>
+      <w:pPr>
+        <w:numPr>
+          <w:ilvl w:val="1"/>
+          <w:numId w:val="15"/>
+        </w:numPr>
+      </w:pPr>
+      <w:r>
+        <w:t xml:space="preserve">If SVM score &lt; threshold → </w:t>
+      </w:r>
+      <w:r>
+        <w:rPr>
+          <w:b/>
+          <w:bCs/>
+        </w:rPr>
+        <w:t>Abnormal (faulty) → pass to stage 2</w:t>
+      </w:r>
+    </w:p>
+    <w:p>
+      <w:r>
+        <w:pict w14:anchorId="32AD6DE8">
+          <v:rect id="_x0000_i1031" style="width:0;height:1.5pt" o:hralign="center" o:hrstd="t" o:hr="t" fillcolor="#a0a0a0" stroked="f"/>
+        </w:pict>
+      </w:r>
+    </w:p>
+    <w:p>
+      <w:r>
+        <w:rPr>
+          <w:b/>
+          <w:bCs/>
+        </w:rPr>
+        <w:t>Stage 2: Fault Classification (Supervised)</w:t>
+      </w:r>
+    </w:p>
+    <w:p>
+      <w:pPr>
+        <w:numPr>
+          <w:ilvl w:val="0"/>
+          <w:numId w:val="16"/>
+        </w:numPr>
+      </w:pPr>
+      <w:r>
+        <w:rPr>
+          <w:b/>
+          <w:bCs/>
+        </w:rPr>
+        <w:t>For data/windows flagged as faults by Stage 1:</w:t>
+      </w:r>
+    </w:p>
+    <w:p>
+      <w:pPr>
+        <w:numPr>
+          <w:ilvl w:val="1"/>
+          <w:numId w:val="16"/>
+        </w:numPr>
+      </w:pPr>
+      <w:r>
+        <w:rPr>
+          <w:b/>
+          <w:bCs/>
+        </w:rPr>
+        <w:t>CNN Classifier:</w:t>
+      </w:r>
+      <w:r>
+        <w:t xml:space="preserve"> Uses the raw (or preprocessed) sensor data window (optionally add VAE recon error as a channel)</w:t>
+      </w:r>
+    </w:p>
+    <w:p>
+      <w:pPr>
+        <w:numPr>
+          <w:ilvl w:val="1"/>
+          <w:numId w:val="16"/>
+        </w:numPr>
+      </w:pPr>
+      <w:r>
+        <w:rPr>
+          <w:b/>
+          <w:bCs/>
+        </w:rPr>
+        <w:t>Trained CNN:</w:t>
+      </w:r>
+      <w:r>
+        <w:t xml:space="preserve"> Predicts type of fault (Sensor vs. Structural, or more fine-grained classes)</w:t>
+      </w:r>
+    </w:p>
     <w:p/>
     <w:sectPr>
       <w:pgSz w:w="12240" w:h="15840"/>
@@ -3142,6 +3679,304 @@
 <file path=word/numbering.xml><?xml version="1.0" encoding="utf-8"?>
 <w:numbering xmlns:wpc="http://schemas.microsoft.com/office/word/2010/wordprocessingCanvas" xmlns:cx="http://schemas.microsoft.com/office/drawing/2014/chartex" xmlns:cx1="http://schemas.microsoft.com/office/drawing/2015/9/8/chartex" xmlns:cx2="http://schemas.microsoft.com/office/drawing/2015/10/21/chartex" xmlns:cx3="http://schemas.microsoft.com/office/drawing/2016/5/9/chartex" xmlns:cx4="http://schemas.microsoft.com/office/drawing/2016/5/10/chartex" xmlns:cx5="http://schemas.microsoft.com/office/drawing/2016/5/11/chartex" xmlns:cx6="http://schemas.microsoft.com/office/drawing/2016/5/12/chartex" xmlns:cx7="http://schemas.microsoft.com/office/drawing/2016/5/13/chartex" xmlns:cx8="http://schemas.microsoft.com/office/drawing/2016/5/14/chartex" xmlns:mc="http://schemas.openxmlformats.org/markup-compatibility/2006" xmlns:aink="http://schemas.microsoft.com/office/drawing/2016/ink" xmlns:am3d="http://schemas.microsoft.com/office/drawing/2017/model3d" xmlns:o="urn:schemas-microsoft-com:office:office" xmlns:oel="http://schemas.microsoft.com/office/2019/extlst" xmlns:r="http://schemas.openxmlformats.org/officeDocument/2006/relationships" xmlns:m="http://schemas.openxmlformats.org/officeDocument/2006/math" xmlns:v="urn:schemas-microsoft-com:vml" xmlns:wp14="http://schemas.microsoft.com/office/word/2010/wordprocessingDrawing" xmlns:wp="http://schemas.openxmlformats.org/drawingml/2006/wordprocessingDrawing" xmlns:w10="urn:schemas-microsoft-com:office:word" xmlns:w="http://schemas.openxmlformats.org/wordprocessingml/2006/main" xmlns:w14="http://schemas.microsoft.com/office/word/2010/wordml" xmlns:w15="http://schemas.microsoft.com/office/word/2012/wordml" xmlns:w16cex="http://schemas.microsoft.com/office/word/2018/wordml/cex" xmlns:w16cid="http://schemas.microsoft.com/office/word/2016/wordml/cid" xmlns:w16="http://schemas.microsoft.com/office/word/2018/wordml" xmlns:w16du="http://schemas.microsoft.com/office/word/2023/wordml/word16du" xmlns:w16sdtdh="http://schemas.microsoft.com/office/word/2020/wordml/sdtdatahash" xmlns:w16sdtfl="http://schemas.microsoft.com/office/word/2024/wordml/sdtformatlock" xmlns:w16se="http://schemas.microsoft.com/office/word/2015/wordml/symex" xmlns:wpg="http://schemas.microsoft.com/office/word/2010/wordprocessingGroup" xmlns:wpi="http://schemas.microsoft.com/office/word/2010/wordprocessingInk" xmlns:wne="http://schemas.microsoft.com/office/word/2006/wordml" xmlns:wps="http://schemas.microsoft.com/office/word/2010/wordprocessingShape" mc:Ignorable="w14 w15 w16se w16cid w16 w16cex w16sdtdh w16sdtfl w16du wp14">
   <w:abstractNum w:abstractNumId="0" w15:restartNumberingAfterBreak="0">
+    <w:nsid w:val="0B3D41B2"/>
+    <w:multiLevelType w:val="multilevel"/>
+    <w:tmpl w:val="15EA2F6A"/>
+    <w:lvl w:ilvl="0">
+      <w:start w:val="1"/>
+      <w:numFmt w:val="bullet"/>
+      <w:lvlText w:val=""/>
+      <w:lvlJc w:val="left"/>
+      <w:pPr>
+        <w:tabs>
+          <w:tab w:val="num" w:pos="720"/>
+        </w:tabs>
+        <w:ind w:left="720" w:hanging="360"/>
+      </w:pPr>
+      <w:rPr>
+        <w:rFonts w:ascii="Symbol" w:hAnsi="Symbol" w:hint="default"/>
+        <w:sz w:val="20"/>
+      </w:rPr>
+    </w:lvl>
+    <w:lvl w:ilvl="1">
+      <w:start w:val="1"/>
+      <w:numFmt w:val="bullet"/>
+      <w:lvlText w:val="o"/>
+      <w:lvlJc w:val="left"/>
+      <w:pPr>
+        <w:tabs>
+          <w:tab w:val="num" w:pos="1440"/>
+        </w:tabs>
+        <w:ind w:left="1440" w:hanging="360"/>
+      </w:pPr>
+      <w:rPr>
+        <w:rFonts w:ascii="Courier New" w:hAnsi="Courier New" w:hint="default"/>
+        <w:sz w:val="20"/>
+      </w:rPr>
+    </w:lvl>
+    <w:lvl w:ilvl="2" w:tentative="1">
+      <w:start w:val="1"/>
+      <w:numFmt w:val="bullet"/>
+      <w:lvlText w:val=""/>
+      <w:lvlJc w:val="left"/>
+      <w:pPr>
+        <w:tabs>
+          <w:tab w:val="num" w:pos="2160"/>
+        </w:tabs>
+        <w:ind w:left="2160" w:hanging="360"/>
+      </w:pPr>
+      <w:rPr>
+        <w:rFonts w:ascii="Wingdings" w:hAnsi="Wingdings" w:hint="default"/>
+        <w:sz w:val="20"/>
+      </w:rPr>
+    </w:lvl>
+    <w:lvl w:ilvl="3" w:tentative="1">
+      <w:start w:val="1"/>
+      <w:numFmt w:val="bullet"/>
+      <w:lvlText w:val=""/>
+      <w:lvlJc w:val="left"/>
+      <w:pPr>
+        <w:tabs>
+          <w:tab w:val="num" w:pos="2880"/>
+        </w:tabs>
+        <w:ind w:left="2880" w:hanging="360"/>
+      </w:pPr>
+      <w:rPr>
+        <w:rFonts w:ascii="Wingdings" w:hAnsi="Wingdings" w:hint="default"/>
+        <w:sz w:val="20"/>
+      </w:rPr>
+    </w:lvl>
+    <w:lvl w:ilvl="4" w:tentative="1">
+      <w:start w:val="1"/>
+      <w:numFmt w:val="bullet"/>
+      <w:lvlText w:val=""/>
+      <w:lvlJc w:val="left"/>
+      <w:pPr>
+        <w:tabs>
+          <w:tab w:val="num" w:pos="3600"/>
+        </w:tabs>
+        <w:ind w:left="3600" w:hanging="360"/>
+      </w:pPr>
+      <w:rPr>
+        <w:rFonts w:ascii="Wingdings" w:hAnsi="Wingdings" w:hint="default"/>
+        <w:sz w:val="20"/>
+      </w:rPr>
+    </w:lvl>
+    <w:lvl w:ilvl="5" w:tentative="1">
+      <w:start w:val="1"/>
+      <w:numFmt w:val="bullet"/>
+      <w:lvlText w:val=""/>
+      <w:lvlJc w:val="left"/>
+      <w:pPr>
+        <w:tabs>
+          <w:tab w:val="num" w:pos="4320"/>
+        </w:tabs>
+        <w:ind w:left="4320" w:hanging="360"/>
+      </w:pPr>
+      <w:rPr>
+        <w:rFonts w:ascii="Wingdings" w:hAnsi="Wingdings" w:hint="default"/>
+        <w:sz w:val="20"/>
+      </w:rPr>
+    </w:lvl>
+    <w:lvl w:ilvl="6" w:tentative="1">
+      <w:start w:val="1"/>
+      <w:numFmt w:val="bullet"/>
+      <w:lvlText w:val=""/>
+      <w:lvlJc w:val="left"/>
+      <w:pPr>
+        <w:tabs>
+          <w:tab w:val="num" w:pos="5040"/>
+        </w:tabs>
+        <w:ind w:left="5040" w:hanging="360"/>
+      </w:pPr>
+      <w:rPr>
+        <w:rFonts w:ascii="Wingdings" w:hAnsi="Wingdings" w:hint="default"/>
+        <w:sz w:val="20"/>
+      </w:rPr>
+    </w:lvl>
+    <w:lvl w:ilvl="7" w:tentative="1">
+      <w:start w:val="1"/>
+      <w:numFmt w:val="bullet"/>
+      <w:lvlText w:val=""/>
+      <w:lvlJc w:val="left"/>
+      <w:pPr>
+        <w:tabs>
+          <w:tab w:val="num" w:pos="5760"/>
+        </w:tabs>
+        <w:ind w:left="5760" w:hanging="360"/>
+      </w:pPr>
+      <w:rPr>
+        <w:rFonts w:ascii="Wingdings" w:hAnsi="Wingdings" w:hint="default"/>
+        <w:sz w:val="20"/>
+      </w:rPr>
+    </w:lvl>
+    <w:lvl w:ilvl="8" w:tentative="1">
+      <w:start w:val="1"/>
+      <w:numFmt w:val="bullet"/>
+      <w:lvlText w:val=""/>
+      <w:lvlJc w:val="left"/>
+      <w:pPr>
+        <w:tabs>
+          <w:tab w:val="num" w:pos="6480"/>
+        </w:tabs>
+        <w:ind w:left="6480" w:hanging="360"/>
+      </w:pPr>
+      <w:rPr>
+        <w:rFonts w:ascii="Wingdings" w:hAnsi="Wingdings" w:hint="default"/>
+        <w:sz w:val="20"/>
+      </w:rPr>
+    </w:lvl>
+  </w:abstractNum>
+  <w:abstractNum w:abstractNumId="1" w15:restartNumberingAfterBreak="0">
+    <w:nsid w:val="0CD92536"/>
+    <w:multiLevelType w:val="multilevel"/>
+    <w:tmpl w:val="63FC2F02"/>
+    <w:lvl w:ilvl="0">
+      <w:start w:val="1"/>
+      <w:numFmt w:val="bullet"/>
+      <w:lvlText w:val=""/>
+      <w:lvlJc w:val="left"/>
+      <w:pPr>
+        <w:tabs>
+          <w:tab w:val="num" w:pos="720"/>
+        </w:tabs>
+        <w:ind w:left="720" w:hanging="360"/>
+      </w:pPr>
+      <w:rPr>
+        <w:rFonts w:ascii="Symbol" w:hAnsi="Symbol" w:hint="default"/>
+        <w:sz w:val="20"/>
+      </w:rPr>
+    </w:lvl>
+    <w:lvl w:ilvl="1">
+      <w:start w:val="1"/>
+      <w:numFmt w:val="bullet"/>
+      <w:lvlText w:val="o"/>
+      <w:lvlJc w:val="left"/>
+      <w:pPr>
+        <w:tabs>
+          <w:tab w:val="num" w:pos="1440"/>
+        </w:tabs>
+        <w:ind w:left="1440" w:hanging="360"/>
+      </w:pPr>
+      <w:rPr>
+        <w:rFonts w:ascii="Courier New" w:hAnsi="Courier New" w:hint="default"/>
+        <w:sz w:val="20"/>
+      </w:rPr>
+    </w:lvl>
+    <w:lvl w:ilvl="2" w:tentative="1">
+      <w:start w:val="1"/>
+      <w:numFmt w:val="bullet"/>
+      <w:lvlText w:val=""/>
+      <w:lvlJc w:val="left"/>
+      <w:pPr>
+        <w:tabs>
+          <w:tab w:val="num" w:pos="2160"/>
+        </w:tabs>
+        <w:ind w:left="2160" w:hanging="360"/>
+      </w:pPr>
+      <w:rPr>
+        <w:rFonts w:ascii="Wingdings" w:hAnsi="Wingdings" w:hint="default"/>
+        <w:sz w:val="20"/>
+      </w:rPr>
+    </w:lvl>
+    <w:lvl w:ilvl="3" w:tentative="1">
+      <w:start w:val="1"/>
+      <w:numFmt w:val="bullet"/>
+      <w:lvlText w:val=""/>
+      <w:lvlJc w:val="left"/>
+      <w:pPr>
+        <w:tabs>
+          <w:tab w:val="num" w:pos="2880"/>
+        </w:tabs>
+        <w:ind w:left="2880" w:hanging="360"/>
+      </w:pPr>
+      <w:rPr>
+        <w:rFonts w:ascii="Wingdings" w:hAnsi="Wingdings" w:hint="default"/>
+        <w:sz w:val="20"/>
+      </w:rPr>
+    </w:lvl>
+    <w:lvl w:ilvl="4" w:tentative="1">
+      <w:start w:val="1"/>
+      <w:numFmt w:val="bullet"/>
+      <w:lvlText w:val=""/>
+      <w:lvlJc w:val="left"/>
+      <w:pPr>
+        <w:tabs>
+          <w:tab w:val="num" w:pos="3600"/>
+        </w:tabs>
+        <w:ind w:left="3600" w:hanging="360"/>
+      </w:pPr>
+      <w:rPr>
+        <w:rFonts w:ascii="Wingdings" w:hAnsi="Wingdings" w:hint="default"/>
+        <w:sz w:val="20"/>
+      </w:rPr>
+    </w:lvl>
+    <w:lvl w:ilvl="5" w:tentative="1">
+      <w:start w:val="1"/>
+      <w:numFmt w:val="bullet"/>
+      <w:lvlText w:val=""/>
+      <w:lvlJc w:val="left"/>
+      <w:pPr>
+        <w:tabs>
+          <w:tab w:val="num" w:pos="4320"/>
+        </w:tabs>
+        <w:ind w:left="4320" w:hanging="360"/>
+      </w:pPr>
+      <w:rPr>
+        <w:rFonts w:ascii="Wingdings" w:hAnsi="Wingdings" w:hint="default"/>
+        <w:sz w:val="20"/>
+      </w:rPr>
+    </w:lvl>
+    <w:lvl w:ilvl="6" w:tentative="1">
+      <w:start w:val="1"/>
+      <w:numFmt w:val="bullet"/>
+      <w:lvlText w:val=""/>
+      <w:lvlJc w:val="left"/>
+      <w:pPr>
+        <w:tabs>
+          <w:tab w:val="num" w:pos="5040"/>
+        </w:tabs>
+        <w:ind w:left="5040" w:hanging="360"/>
+      </w:pPr>
+      <w:rPr>
+        <w:rFonts w:ascii="Wingdings" w:hAnsi="Wingdings" w:hint="default"/>
+        <w:sz w:val="20"/>
+      </w:rPr>
+    </w:lvl>
+    <w:lvl w:ilvl="7" w:tentative="1">
+      <w:start w:val="1"/>
+      <w:numFmt w:val="bullet"/>
+      <w:lvlText w:val=""/>
+      <w:lvlJc w:val="left"/>
+      <w:pPr>
+        <w:tabs>
+          <w:tab w:val="num" w:pos="5760"/>
+        </w:tabs>
+        <w:ind w:left="5760" w:hanging="360"/>
+      </w:pPr>
+      <w:rPr>
+        <w:rFonts w:ascii="Wingdings" w:hAnsi="Wingdings" w:hint="default"/>
+        <w:sz w:val="20"/>
+      </w:rPr>
+    </w:lvl>
+    <w:lvl w:ilvl="8" w:tentative="1">
+      <w:start w:val="1"/>
+      <w:numFmt w:val="bullet"/>
+      <w:lvlText w:val=""/>
+      <w:lvlJc w:val="left"/>
+      <w:pPr>
+        <w:tabs>
+          <w:tab w:val="num" w:pos="6480"/>
+        </w:tabs>
+        <w:ind w:left="6480" w:hanging="360"/>
+      </w:pPr>
+      <w:rPr>
+        <w:rFonts w:ascii="Wingdings" w:hAnsi="Wingdings" w:hint="default"/>
+        <w:sz w:val="20"/>
+      </w:rPr>
+    </w:lvl>
+  </w:abstractNum>
+  <w:abstractNum w:abstractNumId="2" w15:restartNumberingAfterBreak="0">
     <w:nsid w:val="1BC17681"/>
     <w:multiLevelType w:val="multilevel"/>
     <w:tmpl w:val="18DAB8C2"/>
@@ -3262,7 +4097,7 @@
       </w:pPr>
     </w:lvl>
   </w:abstractNum>
-  <w:abstractNum w:abstractNumId="1" w15:restartNumberingAfterBreak="0">
+  <w:abstractNum w:abstractNumId="3" w15:restartNumberingAfterBreak="0">
     <w:nsid w:val="2AD9048D"/>
     <w:multiLevelType w:val="multilevel"/>
     <w:tmpl w:val="9E6C0F6C"/>
@@ -3383,7 +4218,7 @@
       </w:pPr>
     </w:lvl>
   </w:abstractNum>
-  <w:abstractNum w:abstractNumId="2" w15:restartNumberingAfterBreak="0">
+  <w:abstractNum w:abstractNumId="4" w15:restartNumberingAfterBreak="0">
     <w:nsid w:val="2FEA5573"/>
     <w:multiLevelType w:val="multilevel"/>
     <w:tmpl w:val="CEECB1EA"/>
@@ -3532,7 +4367,7 @@
       </w:rPr>
     </w:lvl>
   </w:abstractNum>
-  <w:abstractNum w:abstractNumId="3" w15:restartNumberingAfterBreak="0">
+  <w:abstractNum w:abstractNumId="5" w15:restartNumberingAfterBreak="0">
     <w:nsid w:val="33476BB6"/>
     <w:multiLevelType w:val="multilevel"/>
     <w:tmpl w:val="DA382F94"/>
@@ -3681,7 +4516,7 @@
       </w:rPr>
     </w:lvl>
   </w:abstractNum>
-  <w:abstractNum w:abstractNumId="4" w15:restartNumberingAfterBreak="0">
+  <w:abstractNum w:abstractNumId="6" w15:restartNumberingAfterBreak="0">
     <w:nsid w:val="34236999"/>
     <w:multiLevelType w:val="multilevel"/>
     <w:tmpl w:val="B9CE9DC2"/>
@@ -3830,7 +4665,7 @@
       </w:rPr>
     </w:lvl>
   </w:abstractNum>
-  <w:abstractNum w:abstractNumId="5" w15:restartNumberingAfterBreak="0">
+  <w:abstractNum w:abstractNumId="7" w15:restartNumberingAfterBreak="0">
     <w:nsid w:val="37587214"/>
     <w:multiLevelType w:val="multilevel"/>
     <w:tmpl w:val="81F2A450"/>
@@ -3979,7 +4814,7 @@
       </w:rPr>
     </w:lvl>
   </w:abstractNum>
-  <w:abstractNum w:abstractNumId="6" w15:restartNumberingAfterBreak="0">
+  <w:abstractNum w:abstractNumId="8" w15:restartNumberingAfterBreak="0">
     <w:nsid w:val="429A510D"/>
     <w:multiLevelType w:val="multilevel"/>
     <w:tmpl w:val="43E8A73C"/>
@@ -4100,7 +4935,7 @@
       </w:pPr>
     </w:lvl>
   </w:abstractNum>
-  <w:abstractNum w:abstractNumId="7" w15:restartNumberingAfterBreak="0">
+  <w:abstractNum w:abstractNumId="9" w15:restartNumberingAfterBreak="0">
     <w:nsid w:val="4E4323AD"/>
     <w:multiLevelType w:val="multilevel"/>
     <w:tmpl w:val="D08C2594"/>
@@ -4249,7 +5084,7 @@
       </w:rPr>
     </w:lvl>
   </w:abstractNum>
-  <w:abstractNum w:abstractNumId="8" w15:restartNumberingAfterBreak="0">
+  <w:abstractNum w:abstractNumId="10" w15:restartNumberingAfterBreak="0">
     <w:nsid w:val="52386E20"/>
     <w:multiLevelType w:val="multilevel"/>
     <w:tmpl w:val="0BB69FBE"/>
@@ -4398,7 +5233,132 @@
       </w:rPr>
     </w:lvl>
   </w:abstractNum>
-  <w:abstractNum w:abstractNumId="9" w15:restartNumberingAfterBreak="0">
+  <w:abstractNum w:abstractNumId="11" w15:restartNumberingAfterBreak="0">
+    <w:nsid w:val="5C097C3E"/>
+    <w:multiLevelType w:val="multilevel"/>
+    <w:tmpl w:val="33861614"/>
+    <w:lvl w:ilvl="0">
+      <w:start w:val="1"/>
+      <w:numFmt w:val="decimal"/>
+      <w:lvlText w:val="%1."/>
+      <w:lvlJc w:val="left"/>
+      <w:pPr>
+        <w:tabs>
+          <w:tab w:val="num" w:pos="720"/>
+        </w:tabs>
+        <w:ind w:left="720" w:hanging="360"/>
+      </w:pPr>
+    </w:lvl>
+    <w:lvl w:ilvl="1">
+      <w:start w:val="1"/>
+      <w:numFmt w:val="bullet"/>
+      <w:lvlText w:val="o"/>
+      <w:lvlJc w:val="left"/>
+      <w:pPr>
+        <w:tabs>
+          <w:tab w:val="num" w:pos="1440"/>
+        </w:tabs>
+        <w:ind w:left="1440" w:hanging="360"/>
+      </w:pPr>
+      <w:rPr>
+        <w:rFonts w:ascii="Courier New" w:hAnsi="Courier New" w:hint="default"/>
+        <w:sz w:val="20"/>
+      </w:rPr>
+    </w:lvl>
+    <w:lvl w:ilvl="2">
+      <w:start w:val="1"/>
+      <w:numFmt w:val="bullet"/>
+      <w:lvlText w:val=""/>
+      <w:lvlJc w:val="left"/>
+      <w:pPr>
+        <w:tabs>
+          <w:tab w:val="num" w:pos="2160"/>
+        </w:tabs>
+        <w:ind w:left="2160" w:hanging="360"/>
+      </w:pPr>
+      <w:rPr>
+        <w:rFonts w:ascii="Wingdings" w:hAnsi="Wingdings" w:hint="default"/>
+        <w:sz w:val="20"/>
+      </w:rPr>
+    </w:lvl>
+    <w:lvl w:ilvl="3">
+      <w:start w:val="1"/>
+      <w:numFmt w:val="bullet"/>
+      <w:lvlText w:val=""/>
+      <w:lvlJc w:val="left"/>
+      <w:pPr>
+        <w:tabs>
+          <w:tab w:val="num" w:pos="2880"/>
+        </w:tabs>
+        <w:ind w:left="2880" w:hanging="360"/>
+      </w:pPr>
+      <w:rPr>
+        <w:rFonts w:ascii="Wingdings" w:hAnsi="Wingdings" w:hint="default"/>
+        <w:sz w:val="20"/>
+      </w:rPr>
+    </w:lvl>
+    <w:lvl w:ilvl="4" w:tentative="1">
+      <w:start w:val="1"/>
+      <w:numFmt w:val="decimal"/>
+      <w:lvlText w:val="%5."/>
+      <w:lvlJc w:val="left"/>
+      <w:pPr>
+        <w:tabs>
+          <w:tab w:val="num" w:pos="3600"/>
+        </w:tabs>
+        <w:ind w:left="3600" w:hanging="360"/>
+      </w:pPr>
+    </w:lvl>
+    <w:lvl w:ilvl="5" w:tentative="1">
+      <w:start w:val="1"/>
+      <w:numFmt w:val="decimal"/>
+      <w:lvlText w:val="%6."/>
+      <w:lvlJc w:val="left"/>
+      <w:pPr>
+        <w:tabs>
+          <w:tab w:val="num" w:pos="4320"/>
+        </w:tabs>
+        <w:ind w:left="4320" w:hanging="360"/>
+      </w:pPr>
+    </w:lvl>
+    <w:lvl w:ilvl="6" w:tentative="1">
+      <w:start w:val="1"/>
+      <w:numFmt w:val="decimal"/>
+      <w:lvlText w:val="%7."/>
+      <w:lvlJc w:val="left"/>
+      <w:pPr>
+        <w:tabs>
+          <w:tab w:val="num" w:pos="5040"/>
+        </w:tabs>
+        <w:ind w:left="5040" w:hanging="360"/>
+      </w:pPr>
+    </w:lvl>
+    <w:lvl w:ilvl="7" w:tentative="1">
+      <w:start w:val="1"/>
+      <w:numFmt w:val="decimal"/>
+      <w:lvlText w:val="%8."/>
+      <w:lvlJc w:val="left"/>
+      <w:pPr>
+        <w:tabs>
+          <w:tab w:val="num" w:pos="5760"/>
+        </w:tabs>
+        <w:ind w:left="5760" w:hanging="360"/>
+      </w:pPr>
+    </w:lvl>
+    <w:lvl w:ilvl="8" w:tentative="1">
+      <w:start w:val="1"/>
+      <w:numFmt w:val="decimal"/>
+      <w:lvlText w:val="%9."/>
+      <w:lvlJc w:val="left"/>
+      <w:pPr>
+        <w:tabs>
+          <w:tab w:val="num" w:pos="6480"/>
+        </w:tabs>
+        <w:ind w:left="6480" w:hanging="360"/>
+      </w:pPr>
+    </w:lvl>
+  </w:abstractNum>
+  <w:abstractNum w:abstractNumId="12" w15:restartNumberingAfterBreak="0">
     <w:nsid w:val="5CE57AA8"/>
     <w:multiLevelType w:val="multilevel"/>
     <w:tmpl w:val="8F646BC4"/>
@@ -4547,7 +5507,7 @@
       </w:rPr>
     </w:lvl>
   </w:abstractNum>
-  <w:abstractNum w:abstractNumId="10" w15:restartNumberingAfterBreak="0">
+  <w:abstractNum w:abstractNumId="13" w15:restartNumberingAfterBreak="0">
     <w:nsid w:val="6FDA5615"/>
     <w:multiLevelType w:val="multilevel"/>
     <w:tmpl w:val="34CCE30E"/>
@@ -4696,7 +5656,7 @@
       </w:rPr>
     </w:lvl>
   </w:abstractNum>
-  <w:abstractNum w:abstractNumId="11" w15:restartNumberingAfterBreak="0">
+  <w:abstractNum w:abstractNumId="14" w15:restartNumberingAfterBreak="0">
     <w:nsid w:val="7E305B7E"/>
     <w:multiLevelType w:val="multilevel"/>
     <w:tmpl w:val="8E8628BA"/>
@@ -4822,40 +5782,40 @@
     </w:lvl>
   </w:abstractNum>
   <w:num w:numId="1" w16cid:durableId="171845381">
+    <w:abstractNumId w:val="8"/>
+  </w:num>
+  <w:num w:numId="2" w16cid:durableId="2017532895">
+    <w:abstractNumId w:val="4"/>
+  </w:num>
+  <w:num w:numId="3" w16cid:durableId="1483307522">
+    <w:abstractNumId w:val="14"/>
+  </w:num>
+  <w:num w:numId="4" w16cid:durableId="1942302323">
+    <w:abstractNumId w:val="3"/>
+  </w:num>
+  <w:num w:numId="5" w16cid:durableId="950476463">
+    <w:abstractNumId w:val="2"/>
+  </w:num>
+  <w:num w:numId="6" w16cid:durableId="1744719573">
+    <w:abstractNumId w:val="10"/>
+  </w:num>
+  <w:num w:numId="7" w16cid:durableId="270163184">
+    <w:abstractNumId w:val="9"/>
+  </w:num>
+  <w:num w:numId="8" w16cid:durableId="1381172915">
     <w:abstractNumId w:val="6"/>
   </w:num>
-  <w:num w:numId="2" w16cid:durableId="2017532895">
-    <w:abstractNumId w:val="2"/>
+  <w:num w:numId="9" w16cid:durableId="297800606">
+    <w:abstractNumId w:val="13"/>
   </w:num>
-  <w:num w:numId="3" w16cid:durableId="1483307522">
-    <w:abstractNumId w:val="11"/>
-  </w:num>
-  <w:num w:numId="4" w16cid:durableId="1942302323">
-    <w:abstractNumId w:val="1"/>
-  </w:num>
-  <w:num w:numId="5" w16cid:durableId="950476463">
-    <w:abstractNumId w:val="0"/>
-  </w:num>
-  <w:num w:numId="6" w16cid:durableId="1744719573">
-    <w:abstractNumId w:val="8"/>
-  </w:num>
-  <w:num w:numId="7" w16cid:durableId="270163184">
+  <w:num w:numId="10" w16cid:durableId="404258572">
     <w:abstractNumId w:val="7"/>
   </w:num>
-  <w:num w:numId="8" w16cid:durableId="1381172915">
-    <w:abstractNumId w:val="4"/>
-  </w:num>
-  <w:num w:numId="9" w16cid:durableId="297800606">
-    <w:abstractNumId w:val="10"/>
-  </w:num>
-  <w:num w:numId="10" w16cid:durableId="404258572">
+  <w:num w:numId="11" w16cid:durableId="1597052530">
     <w:abstractNumId w:val="5"/>
   </w:num>
-  <w:num w:numId="11" w16cid:durableId="1597052530">
-    <w:abstractNumId w:val="3"/>
-  </w:num>
   <w:num w:numId="12" w16cid:durableId="712968845">
-    <w:abstractNumId w:val="3"/>
+    <w:abstractNumId w:val="5"/>
     <w:lvlOverride w:ilvl="1">
       <w:lvl w:ilvl="1">
         <w:numFmt w:val="decimal"/>
@@ -4865,7 +5825,16 @@
     </w:lvlOverride>
   </w:num>
   <w:num w:numId="13" w16cid:durableId="1672877521">
-    <w:abstractNumId w:val="9"/>
+    <w:abstractNumId w:val="12"/>
+  </w:num>
+  <w:num w:numId="14" w16cid:durableId="535313532">
+    <w:abstractNumId w:val="11"/>
+  </w:num>
+  <w:num w:numId="15" w16cid:durableId="536159057">
+    <w:abstractNumId w:val="0"/>
+  </w:num>
+  <w:num w:numId="16" w16cid:durableId="1890802971">
+    <w:abstractNumId w:val="1"/>
   </w:num>
 </w:numbering>
 </file>

</xml_diff>